<commit_message>
docs: restore professional resume tone in Word exports
Keep formal wording from the earlier revision, while still removing
semicolons and hybrid-role labels from the four .docx resumes.

Co-authored-by: Ryan19z <Ryan19z@users.noreply.github.com>
</commit_message>
<xml_diff>
--- a/resume-output/docx/Hou-Zhongqi-Overseas-Technical-Support-EN-1page.docx
+++ b/resume-output/docx/Hou-Zhongqi-Overseas-Technical-Support-EN-1page.docx
@@ -27,7 +27,7 @@
           <w:b/>
           <w:sz w:val="20"/>
         </w:rPr>
-        <w:t>Target role: Overseas Technical Support Engineer (Semiconductor Equipment / Robotics) | Shenzhen | Open to overseas travel</w:t>
+        <w:t>Target Role: Overseas Technical Support Engineer (Semiconductor Equipment / Robotics) | Shenzhen | Open to Overseas Travel</w:t>
       </w:r>
     </w:p>
     <w:p>
@@ -41,7 +41,7 @@
           <w:b w:val="0"/>
           <w:sz w:val="19"/>
         </w:rPr>
-        <w:t>English-fluent with overseas customers | UK visa (~2 years) | +86 178-1676-9251 | zhongqi_hou@foxmail.com</w:t>
+        <w:t>English-fluent with overseas customers | UK visa holder (~2 years) | +86 178-1676-9251 | zhongqi_hou@foxmail.com</w:t>
       </w:r>
     </w:p>
     <w:p>
@@ -71,7 +71,7 @@
           <w:b w:val="0"/>
           <w:sz w:val="19"/>
         </w:rPr>
-        <w:t>Handled both remote and on-site support in Europe, including Spain, the Netherlands, France, and Germany. Comfortable training customers and troubleshooting in English.</w:t>
+        <w:t>Experienced in overseas field and remote support across Spain, the Netherlands, France, and Germany, with clear spoken English for customer training and troubleshooting.</w:t>
       </w:r>
     </w:p>
     <w:p>
@@ -85,7 +85,7 @@
           <w:b w:val="0"/>
           <w:sz w:val="19"/>
         </w:rPr>
-        <w:t>Often work between customers and R&amp;D. Followed a key-account wheel-alignment hardware and software request for about four months until the product was delivered.</w:t>
+        <w:t>Strong customer–R&amp;D coordination. Drove a key-account wheel-alignment hardware and software requirement for about four months through clarification, alignment, and product delivery.</w:t>
       </w:r>
     </w:p>
     <w:p>
@@ -99,7 +99,7 @@
           <w:b w:val="0"/>
           <w:sz w:val="19"/>
         </w:rPr>
-        <w:t>Built a service knowledge-base assistant with Cursor on company servers, and also made a simple after-sales ticket board with media upload.</w:t>
+        <w:t>Built an AI knowledge-base assistant with Cursor for the service team, deployed on company servers around the clock. Also developed an after-sales ticket platform with media upload and issue dashboard.</w:t>
       </w:r>
     </w:p>
     <w:p>
@@ -113,7 +113,7 @@
           <w:b w:val="0"/>
           <w:sz w:val="19"/>
         </w:rPr>
-        <w:t>Automation background with three years in a smart-car lab. Can read PCBs, write basic embedded C, and do soldering and multimeter checks. Pick up new product lines fairly quickly.</w:t>
+        <w:t>Automation background with smart-car lab experience in PCB reading, embedded C, soldering, and multimeter debugging. Able to ramp up on new electromechanical product lines quickly.</w:t>
       </w:r>
     </w:p>
     <w:p>
@@ -169,7 +169,7 @@
           <w:color w:val="555555"/>
           <w:sz w:val="19"/>
         </w:rPr>
-        <w:t>Automotive aftermarket test and maintenance equipment. Pre-sales training, after-sales support, and customer–R&amp;D coordination.</w:t>
+        <w:t>Automotive aftermarket test and maintenance equipment | Pre-sales training, after-sales support, and customer–R&amp;D coordination</w:t>
       </w:r>
     </w:p>
     <w:p>
@@ -183,7 +183,7 @@
           <w:b w:val="0"/>
           <w:sz w:val="19"/>
         </w:rPr>
-        <w:t>Covered wheel alignment, ADAS calibration, A/C refrigerant exchange, injector cleaning, ATF exchange, EV battery pack charge/discharge and balancing, and diagnostic tablets. Product training was limited, so I learned mostly from documents and real cases, then supported customers on my own.</w:t>
+        <w:t>Supported product lines including wheel alignment, ADAS calibration, A/C refrigerant exchange, injector cleaning, ATF exchange, EV battery pack charge/discharge and balancing, and diagnostic tablets. Built independent support capability quickly under limited formal training.</w:t>
       </w:r>
     </w:p>
     <w:p>
@@ -197,7 +197,7 @@
           <w:b w:val="0"/>
           <w:sz w:val="19"/>
         </w:rPr>
-        <w:t>Traveled to Spain, the Netherlands, France, and Germany for on-site fault handling and product training with dealers and end users.</w:t>
+        <w:t>Conducted on-site fault handling and product training in Spain, the Netherlands, France, and Germany for dealers and end users.</w:t>
       </w:r>
     </w:p>
     <w:p>
@@ -211,7 +211,7 @@
           <w:b w:val="0"/>
           <w:sz w:val="19"/>
         </w:rPr>
-        <w:t>Spent about four months on a key-account wheel-alignment HW/SW request. Clarified changes for R&amp;D, explained limits and progress back to the customer, and helped get the product delivered.</w:t>
+        <w:t>Led about four months of key-account wheel-alignment HW/SW requirement alignment between customer and R&amp;D, clarifying scope, synchronizing validation pace, and completing delivery.</w:t>
       </w:r>
     </w:p>
     <w:p>
@@ -225,7 +225,21 @@
           <w:b w:val="0"/>
           <w:sz w:val="19"/>
         </w:rPr>
-        <w:t>Built a Q&amp;A knowledge base with Cursor for common fixes and product files. Opened accounts for sales and service, and kept it running on company servers around the clock so people could find materials across time zones. Also built a ticket tool with video, image, and document upload, plus a simple issue dashboard.</w:t>
+        <w:t>Built a Q&amp;A knowledge base with Cursor covering common fixes and product documents. Provisioned accounts for sales and service, and deployed the system on company servers around the clock to reduce timezone-related document search delays.</w:t>
+      </w:r>
+    </w:p>
+    <w:p>
+      <w:pPr>
+        <w:pStyle w:val="ListBullet"/>
+        <w:spacing w:before="0" w:after="20" w:line="288" w:lineRule="auto"/>
+      </w:pPr>
+      <w:r>
+        <w:rPr>
+          <w:rFonts w:ascii="Calibri" w:hAnsi="Calibri" w:eastAsia="微软雅黑"/>
+          <w:b w:val="0"/>
+          <w:sz w:val="19"/>
+        </w:rPr>
+        <w:t>Developed an after-sales ticket system supporting video, image, and document upload, with case-level customer linkage and a dashboard for cumulative issue tracking.</w:t>
       </w:r>
     </w:p>
     <w:p>
@@ -265,7 +279,7 @@
           <w:color w:val="555555"/>
           <w:sz w:val="19"/>
         </w:rPr>
-        <w:t>3D printing export. Remote technical support for EU and US customers.</w:t>
+        <w:t>3D printing export | Remote technical support for EU and US customers</w:t>
       </w:r>
     </w:p>
     <w:p>
@@ -279,7 +293,21 @@
           <w:b w:val="0"/>
           <w:sz w:val="19"/>
         </w:rPr>
-        <w:t>Learned the product line quickly and handled EU/US inquiries myself. Kept a personal knowledge base and used an AI agent to answer repeat questions faster. Sent recurring issues and design concerns back to product and engineering.</w:t>
+        <w:t>Learned product lines quickly and independently handled EU/US technical inquiries. Built a personal knowledge base and trained an AI agent to improve response efficiency.</w:t>
+      </w:r>
+    </w:p>
+    <w:p>
+      <w:pPr>
+        <w:pStyle w:val="ListBullet"/>
+        <w:spacing w:before="0" w:after="20" w:line="288" w:lineRule="auto"/>
+      </w:pPr>
+      <w:r>
+        <w:rPr>
+          <w:rFonts w:ascii="Calibri" w:hAnsi="Calibri" w:eastAsia="微软雅黑"/>
+          <w:b w:val="0"/>
+          <w:sz w:val="19"/>
+        </w:rPr>
+        <w:t>Systematically fed recurring issues, design gaps, and improvement suggestions back to product and engineering teams.</w:t>
       </w:r>
     </w:p>
     <w:p>
@@ -335,7 +363,7 @@
           <w:b w:val="0"/>
           <w:sz w:val="19"/>
         </w:rPr>
-        <w:t>Three years in the Intelligent Vehicle Lab. Infineon TC264/TC377 GPS+IMU off-road vehicle with PID tuning. Provincial 2nd Prize in the National Intelligent Vehicle Competition (4th in Zhejiang).</w:t>
+        <w:t>Three years in the Intelligent Vehicle Lab. Worked on Infineon TC264/TC377 GPS+IMU off-road vehicle with PID tuning. Provincial 2nd Prize, National Intelligent Vehicle Competition (4th in Zhejiang).</w:t>
       </w:r>
     </w:p>
     <w:p>
@@ -349,7 +377,7 @@
           <w:b w:val="0"/>
           <w:sz w:val="19"/>
         </w:rPr>
-        <w:t>Basics in STM32, sensor drivers, UART/SPI, FreeRTOS, PCB reading, soldering, multimeter work, and embedded C.</w:t>
+        <w:t>Foundation in STM32, sensor drivers, UART/SPI, FreeRTOS basics, PCB reading, soldering, multimeter debugging, and embedded C.</w:t>
       </w:r>
     </w:p>
     <w:p>
@@ -379,7 +407,7 @@
           <w:b w:val="0"/>
           <w:sz w:val="19"/>
         </w:rPr>
-        <w:t>Languages: CET-6 English. Can handle overseas calls, on-site training, and technical email.</w:t>
+        <w:t>Languages: CET-6 English. Able to handle overseas customer calls, on-site training, and technical email.</w:t>
       </w:r>
     </w:p>
     <w:p>
@@ -393,7 +421,7 @@
           <w:b w:val="0"/>
           <w:sz w:val="19"/>
         </w:rPr>
-        <w:t>Support: multi-product diagnosis, pre-sales training, translating customer needs for R&amp;D, and explaining solutions back to customers and sales.</w:t>
+        <w:t>Support: multi-product after-sales diagnosis, pre-sales training, requirement translation, and cross-team coordination among customers, R&amp;D, and sales.</w:t>
       </w:r>
     </w:p>
     <w:p>
@@ -407,7 +435,7 @@
           <w:b w:val="0"/>
           <w:sz w:val="19"/>
         </w:rPr>
-        <w:t>Technical: automation and embedded basics, some Python/Matlab, Cursor for docs and small internal tools. Prefer Shenzhen. Travel about three times a year, about one month each.</w:t>
+        <w:t>Technical: automation and embedded fundamentals, Python/Matlab data analysis, Cursor/AI tooling, knowledge-base and ticket workflow building. Prefer Shenzhen. Open to about three overseas trips per year, about one month each.</w:t>
       </w:r>
     </w:p>
     <w:p>
@@ -450,7 +478,7 @@
           <w:b w:val="0"/>
           <w:sz w:val="19"/>
         </w:rPr>
-        <w:t>I communicate clearly and learn quickly. I want to stay in overseas technical support first, get solid with equipment and customers, then move toward overseas sales later.</w:t>
+        <w:t>Strong communicator and fast learner, effective at clarifying field issues and driving solutions between customers and R&amp;D. Seeking to deepen overseas technical support in semiconductor equipment or robotics, then grow toward overseas sales.</w:t>
       </w:r>
     </w:p>
     <w:sectPr>

</xml_diff>

<commit_message>
docs: export original first-version resumes as editable docx
Convert the initial Chinese/English 1-page and 2-page resume content
to .docx without rewriting wording, for user self-editing.

Co-authored-by: Ryan19z <Ryan19z@users.noreply.github.com>
</commit_message>
<xml_diff>
--- a/resume-output/docx/Hou-Zhongqi-Overseas-Technical-Support-EN-1page.docx
+++ b/resume-output/docx/Hou-Zhongqi-Overseas-Technical-Support-EN-1page.docx
@@ -27,7 +27,7 @@
           <w:b/>
           <w:sz w:val="20"/>
         </w:rPr>
-        <w:t>Target Role: Overseas Technical Support Engineer (Semiconductor Equipment / Robotics) | Shenzhen | Open to Overseas Travel</w:t>
+        <w:t>Overseas Technical Support Engineer (Semiconductor Equipment / Robotics · Hybrid) | Shenzhen</w:t>
       </w:r>
     </w:p>
     <w:p>
@@ -41,7 +41,7 @@
           <w:b w:val="0"/>
           <w:sz w:val="19"/>
         </w:rPr>
-        <w:t>English-fluent with overseas customers | UK visa holder (~2 years) | +86 178-1676-9251 | zhongqi_hou@foxmail.com</w:t>
+        <w:t>English-fluent | UK visa (~2 years) | Overseas travel OK (~3×/year, ~1 month) | +86 178-1676-9251 | zhongqi_hou@foxmail.com</w:t>
       </w:r>
     </w:p>
     <w:p>
@@ -57,12 +57,11 @@
           <w:b/>
           <w:sz w:val="24"/>
         </w:rPr>
-        <w:t>Summary</w:t>
+        <w:t>SUMMARY</w:t>
       </w:r>
     </w:p>
     <w:p>
       <w:pPr>
-        <w:pStyle w:val="ListBullet"/>
         <w:spacing w:before="0" w:after="20" w:line="288" w:lineRule="auto"/>
       </w:pPr>
       <w:r>
@@ -71,12 +70,11 @@
           <w:b w:val="0"/>
           <w:sz w:val="19"/>
         </w:rPr>
-        <w:t>Experienced in overseas field and remote support across Spain, the Netherlands, France, and Germany, with clear spoken English for customer training and troubleshooting.</w:t>
+        <w:t>• Europe field support (Spain / Netherlands / France / Germany) + remote overseas customers; clear spoken English for training and troubleshooting.</w:t>
       </w:r>
     </w:p>
     <w:p>
       <w:pPr>
-        <w:pStyle w:val="ListBullet"/>
         <w:spacing w:before="0" w:after="20" w:line="288" w:lineRule="auto"/>
       </w:pPr>
       <w:r>
@@ -85,12 +83,11 @@
           <w:b w:val="0"/>
           <w:sz w:val="19"/>
         </w:rPr>
-        <w:t>Strong customer–R&amp;D coordination. Drove a key-account wheel-alignment hardware and software requirement for about four months through clarification, alignment, and product delivery.</w:t>
+        <w:t>• Customer–R&amp;D bridge: drove key-account wheel-alignment HW/SW requirements for ~4 months through to product delivery.</w:t>
       </w:r>
     </w:p>
     <w:p>
       <w:pPr>
-        <w:pStyle w:val="ListBullet"/>
         <w:spacing w:before="0" w:after="20" w:line="288" w:lineRule="auto"/>
       </w:pPr>
       <w:r>
@@ -99,12 +96,11 @@
           <w:b w:val="0"/>
           <w:sz w:val="19"/>
         </w:rPr>
-        <w:t>Built an AI knowledge-base assistant with Cursor for the service team, deployed on company servers around the clock. Also developed an after-sales ticket platform with media upload and issue dashboard.</w:t>
+        <w:t>• Built AI knowledge-base assistant (Cursor, 24/7 on company servers) and ticket/dashboard platform for after-sales efficiency across time zones.</w:t>
       </w:r>
     </w:p>
     <w:p>
       <w:pPr>
-        <w:pStyle w:val="ListBullet"/>
         <w:spacing w:before="0" w:after="20" w:line="288" w:lineRule="auto"/>
       </w:pPr>
       <w:r>
@@ -113,7 +109,7 @@
           <w:b w:val="0"/>
           <w:sz w:val="19"/>
         </w:rPr>
-        <w:t>Automation background with smart-car lab experience in PCB reading, embedded C, soldering, and multimeter debugging. Able to ramp up on new electromechanical product lines quickly.</w:t>
+        <w:t>• Automation degree + smart-car lab (PCB, embedded C, sensors)—fast ramp-up on electromechanical equipment.</w:t>
       </w:r>
     </w:p>
     <w:p>
@@ -129,7 +125,7 @@
           <w:b/>
           <w:sz w:val="24"/>
         </w:rPr>
-        <w:t>Experience</w:t>
+        <w:t>EXPERIENCE</w:t>
       </w:r>
     </w:p>
     <w:p>
@@ -145,7 +141,7 @@
           <w:b/>
           <w:sz w:val="21"/>
         </w:rPr>
-        <w:t>SmartSafe — Overseas Technical Support / Service Engineer</w:t>
+        <w:t>SmartSafe (Yijian Intelligent) — Overseas Technical Support / Service Engineer</w:t>
       </w:r>
       <w:r>
         <w:rPr>
@@ -169,12 +165,11 @@
           <w:color w:val="555555"/>
           <w:sz w:val="19"/>
         </w:rPr>
-        <w:t>Automotive aftermarket test and maintenance equipment | Pre-sales training, after-sales support, and customer–R&amp;D coordination</w:t>
+        <w:t>Automotive aftermarket test &amp; maintenance equipment | Pre-sales training, after-sales, customer–R&amp;D coordination</w:t>
       </w:r>
     </w:p>
     <w:p>
       <w:pPr>
-        <w:pStyle w:val="ListBullet"/>
         <w:spacing w:before="0" w:after="20" w:line="288" w:lineRule="auto"/>
       </w:pPr>
       <w:r>
@@ -183,12 +178,11 @@
           <w:b w:val="0"/>
           <w:sz w:val="19"/>
         </w:rPr>
-        <w:t>Supported product lines including wheel alignment, ADAS calibration, A/C refrigerant exchange, injector cleaning, ATF exchange, EV battery pack charge/discharge and balancing, and diagnostic tablets. Built independent support capability quickly under limited formal training.</w:t>
+        <w:t>• Multi-line support: wheel alignment, ADAS calibration, A/C refrigerant exchange, injector cleaning, ATF exchange, EV battery pack charge/discharge &amp; balancing, diagnostic tablets.</w:t>
       </w:r>
     </w:p>
     <w:p>
       <w:pPr>
-        <w:pStyle w:val="ListBullet"/>
         <w:spacing w:before="0" w:after="20" w:line="288" w:lineRule="auto"/>
       </w:pPr>
       <w:r>
@@ -197,12 +191,11 @@
           <w:b w:val="0"/>
           <w:sz w:val="19"/>
         </w:rPr>
-        <w:t>Conducted on-site fault handling and product training in Spain, the Netherlands, France, and Germany for dealers and end users.</w:t>
+        <w:t>• On-site in ES/NL/FR/DE for fault handling, product training, and dealer/end-user enablement.</w:t>
       </w:r>
     </w:p>
     <w:p>
       <w:pPr>
-        <w:pStyle w:val="ListBullet"/>
         <w:spacing w:before="0" w:after="20" w:line="288" w:lineRule="auto"/>
       </w:pPr>
       <w:r>
@@ -211,12 +204,11 @@
           <w:b w:val="0"/>
           <w:sz w:val="19"/>
         </w:rPr>
-        <w:t>Led about four months of key-account wheel-alignment HW/SW requirement alignment between customer and R&amp;D, clarifying scope, synchronizing validation pace, and completing delivery.</w:t>
+        <w:t>• Led ~4-month key-account wheel-alignment HW/SW alignment between customer and R&amp;D until delivery landed.</w:t>
       </w:r>
     </w:p>
     <w:p>
       <w:pPr>
-        <w:pStyle w:val="ListBullet"/>
         <w:spacing w:before="0" w:after="20" w:line="288" w:lineRule="auto"/>
       </w:pPr>
       <w:r>
@@ -225,21 +217,7 @@
           <w:b w:val="0"/>
           <w:sz w:val="19"/>
         </w:rPr>
-        <w:t>Built a Q&amp;A knowledge base with Cursor covering common fixes and product documents. Provisioned accounts for sales and service, and deployed the system on company servers around the clock to reduce timezone-related document search delays.</w:t>
-      </w:r>
-    </w:p>
-    <w:p>
-      <w:pPr>
-        <w:pStyle w:val="ListBullet"/>
-        <w:spacing w:before="0" w:after="20" w:line="288" w:lineRule="auto"/>
-      </w:pPr>
-      <w:r>
-        <w:rPr>
-          <w:rFonts w:ascii="Calibri" w:hAnsi="Calibri" w:eastAsia="微软雅黑"/>
-          <w:b w:val="0"/>
-          <w:sz w:val="19"/>
-        </w:rPr>
-        <w:t>Developed an after-sales ticket system supporting video, image, and document upload, with case-level customer linkage and a dashboard for cumulative issue tracking.</w:t>
+        <w:t>• Built department AI knowledge base (FAQ + docs, chat Q&amp;A) with Cursor; 24/7 server deploy for sales/service; built ticket platform with media upload + issue dashboard.</w:t>
       </w:r>
     </w:p>
     <w:p>
@@ -255,7 +233,7 @@
           <w:b/>
           <w:sz w:val="21"/>
         </w:rPr>
-        <w:t>ELEGOO — Overseas Technical Support Engineer</w:t>
+        <w:t>ELEGOO (Shenzhen Zhinenpai Technology) — Overseas Technical Support Engineer</w:t>
       </w:r>
       <w:r>
         <w:rPr>
@@ -279,12 +257,11 @@
           <w:color w:val="555555"/>
           <w:sz w:val="19"/>
         </w:rPr>
-        <w:t>3D printing export | Remote technical support for EU and US customers</w:t>
+        <w:t>3D printing export | Remote EU/US technical support</w:t>
       </w:r>
     </w:p>
     <w:p>
       <w:pPr>
-        <w:pStyle w:val="ListBullet"/>
         <w:spacing w:before="0" w:after="20" w:line="288" w:lineRule="auto"/>
       </w:pPr>
       <w:r>
@@ -293,21 +270,7 @@
           <w:b w:val="0"/>
           <w:sz w:val="19"/>
         </w:rPr>
-        <w:t>Learned product lines quickly and independently handled EU/US technical inquiries. Built a personal knowledge base and trained an AI agent to improve response efficiency.</w:t>
-      </w:r>
-    </w:p>
-    <w:p>
-      <w:pPr>
-        <w:pStyle w:val="ListBullet"/>
-        <w:spacing w:before="0" w:after="20" w:line="288" w:lineRule="auto"/>
-      </w:pPr>
-      <w:r>
-        <w:rPr>
-          <w:rFonts w:ascii="Calibri" w:hAnsi="Calibri" w:eastAsia="微软雅黑"/>
-          <w:b w:val="0"/>
-          <w:sz w:val="19"/>
-        </w:rPr>
-        <w:t>Systematically fed recurring issues, design gaps, and improvement suggestions back to product and engineering teams.</w:t>
+        <w:t>• Independent EU/US technical inquiry handling; personal knowledge base + AI agent for faster response; structured feedback to product/engineering.</w:t>
       </w:r>
     </w:p>
     <w:p>
@@ -323,7 +286,7 @@
           <w:b/>
           <w:sz w:val="24"/>
         </w:rPr>
-        <w:t>Education</w:t>
+        <w:t>EDUCATION</w:t>
       </w:r>
     </w:p>
     <w:p>
@@ -354,7 +317,6 @@
     </w:p>
     <w:p>
       <w:pPr>
-        <w:pStyle w:val="ListBullet"/>
         <w:spacing w:before="0" w:after="20" w:line="288" w:lineRule="auto"/>
       </w:pPr>
       <w:r>
@@ -363,12 +325,11 @@
           <w:b w:val="0"/>
           <w:sz w:val="19"/>
         </w:rPr>
-        <w:t>Three years in the Intelligent Vehicle Lab. Worked on Infineon TC264/TC377 GPS+IMU off-road vehicle with PID tuning. Provincial 2nd Prize, National Intelligent Vehicle Competition (4th in Zhejiang).</w:t>
+        <w:t>• Intelligent Vehicle Lab (3 yrs): Infineon TC264/TC377 GPS+IMU vehicle; Provincial 2nd Prize, National Intelligent Vehicle Competition (4th in Zhejiang).</w:t>
       </w:r>
     </w:p>
     <w:p>
       <w:pPr>
-        <w:pStyle w:val="ListBullet"/>
         <w:spacing w:before="0" w:after="20" w:line="288" w:lineRule="auto"/>
       </w:pPr>
       <w:r>
@@ -377,7 +338,7 @@
           <w:b w:val="0"/>
           <w:sz w:val="19"/>
         </w:rPr>
-        <w:t>Foundation in STM32, sensor drivers, UART/SPI, FreeRTOS basics, PCB reading, soldering, multimeter debugging, and embedded C.</w:t>
+        <w:t>• STM32 / sensor drivers / UART·SPI / FreeRTOS basics; PCB reading, soldering, multimeter, embedded C.</w:t>
       </w:r>
     </w:p>
     <w:p>
@@ -393,12 +354,11 @@
           <w:b/>
           <w:sz w:val="24"/>
         </w:rPr>
-        <w:t>Skills and Awards</w:t>
+        <w:t>SKILLS &amp; AWARDS</w:t>
       </w:r>
     </w:p>
     <w:p>
       <w:pPr>
-        <w:pStyle w:val="ListBullet"/>
         <w:spacing w:before="0" w:after="20" w:line="288" w:lineRule="auto"/>
       </w:pPr>
       <w:r>
@@ -407,12 +367,11 @@
           <w:b w:val="0"/>
           <w:sz w:val="19"/>
         </w:rPr>
-        <w:t>Languages: CET-6 English. Able to handle overseas customer calls, on-site training, and technical email.</w:t>
+        <w:t>• Languages: CET-6 English — overseas calls, on-site training, technical email.</w:t>
       </w:r>
     </w:p>
     <w:p>
       <w:pPr>
-        <w:pStyle w:val="ListBullet"/>
         <w:spacing w:before="0" w:after="20" w:line="288" w:lineRule="auto"/>
       </w:pPr>
       <w:r>
@@ -421,12 +380,11 @@
           <w:b w:val="0"/>
           <w:sz w:val="19"/>
         </w:rPr>
-        <w:t>Support: multi-product after-sales diagnosis, pre-sales training, requirement translation, and cross-team coordination among customers, R&amp;D, and sales.</w:t>
+        <w:t>• Support: multi-product diagnosis, pre-sales training, requirement translation, customer ↔ R&amp;D ↔ sales coordination.</w:t>
       </w:r>
     </w:p>
     <w:p>
       <w:pPr>
-        <w:pStyle w:val="ListBullet"/>
         <w:spacing w:before="0" w:after="20" w:line="288" w:lineRule="auto"/>
       </w:pPr>
       <w:r>
@@ -435,12 +393,11 @@
           <w:b w:val="0"/>
           <w:sz w:val="19"/>
         </w:rPr>
-        <w:t>Technical: automation and embedded fundamentals, Python/Matlab data analysis, Cursor/AI tooling, knowledge-base and ticket workflow building. Prefer Shenzhen. Open to about three overseas trips per year, about one month each.</w:t>
+        <w:t>• Technical: automation/embedded base; Python/Matlab; Cursor/AI tooling; knowledge-base &amp; ticket workflows. Prefer Shenzhen base.</w:t>
       </w:r>
     </w:p>
     <w:p>
       <w:pPr>
-        <w:pStyle w:val="ListBullet"/>
         <w:spacing w:before="0" w:after="20" w:line="288" w:lineRule="auto"/>
       </w:pPr>
       <w:r>
@@ -449,7 +406,7 @@
           <w:b w:val="0"/>
           <w:sz w:val="19"/>
         </w:rPr>
-        <w:t>Awards: Provincial 2nd Prize, National Intelligent Vehicle Competition (2023). Campus 1st Prize, Zhejiang College English Contest (2022). National 3rd Prize, Puyi English Writing Contest (2023). Scholarships (rank 7/92).</w:t>
+        <w:t>• Awards: Provincial 2nd Prize, National Intelligent Vehicle Competition (2023); Campus 1st, Zhejiang College English Contest (2022); National 3rd, Puyi English Writing (2023); scholarships (7/92).</w:t>
       </w:r>
     </w:p>
     <w:p>
@@ -465,7 +422,7 @@
           <w:b/>
           <w:sz w:val="24"/>
         </w:rPr>
-        <w:t>Profile</w:t>
+        <w:t>PROFILE</w:t>
       </w:r>
     </w:p>
     <w:p>
@@ -478,7 +435,7 @@
           <w:b w:val="0"/>
           <w:sz w:val="19"/>
         </w:rPr>
-        <w:t>Strong communicator and fast learner, effective at clarifying field issues and driving solutions between customers and R&amp;D. Seeking to deepen overseas technical support in semiconductor equipment or robotics, then grow toward overseas sales.</w:t>
+        <w:t>Strong communicator and fast learner; turns field issues into actionable R&amp;D inputs and customer-ready solutions. Aiming to deepen overseas technical support in semiconductor equipment or robotics, then grow toward overseas sales / hybrid roles.</w:t>
       </w:r>
     </w:p>
     <w:sectPr>

</xml_diff>

<commit_message>
docs: convert original resume PDFs to DOCX via pdf2docx
Direct format conversion only—no wording rewrite. Outputs live under
resume-output/docx-from-pdf/ for unambiguous download.

Co-authored-by: Ryan19z <Ryan19z@users.noreply.github.com>
</commit_message>
<xml_diff>
--- a/resume-output/docx/Hou-Zhongqi-Overseas-Technical-Support-EN-1page.docx
+++ b/resume-output/docx/Hou-Zhongqi-Overseas-Technical-Support-EN-1page.docx
@@ -4,444 +4,1012 @@
   <w:body>
     <w:p>
       <w:pPr>
-        <w:spacing w:before="0" w:after="80" w:line="276" w:lineRule="auto"/>
+        <w:autoSpaceDN w:val="0"/>
+        <w:autoSpaceDE w:val="0"/>
+        <w:widowControl/>
+        <w:spacing w:line="220" w:lineRule="exact" w:before="0" w:after="30"/>
+        <w:ind w:left="0" w:right="0"/>
+      </w:pPr>
+    </w:p>
+    <w:p>
+      <w:pPr>
+        <w:autoSpaceDN w:val="0"/>
+        <w:autoSpaceDE w:val="0"/>
+        <w:widowControl/>
+        <w:spacing w:line="240" w:lineRule="auto" w:before="0" w:after="26"/>
+        <w:ind w:left="0" w:right="4860" w:firstLine="0"/>
+        <w:jc w:val="right"/>
+      </w:pPr>
+      <w:r>
+        <w:rPr>
+          <w:rFonts w:ascii="Noto Sans" w:hAnsi="Noto Sans" w:eastAsia="Noto Sans"/>
+          <w:b/>
+          <w:i w:val="0"/>
+          <w:color w:val="1A1A1A"/>
+          <w:sz w:val="36"/>
+        </w:rPr>
+        <w:t>Zhongqi Hou</w:t>
+      </w:r>
+    </w:p>
+    <w:tbl>
+      <w:tblPr>
+        <w:tblW w:type="auto" w:w="0"/>
+        <w:tblLayout w:type="fixed"/>
+        <w:tblLook w:firstColumn="1" w:firstRow="1" w:lastColumn="0" w:lastRow="0" w:noHBand="0" w:noVBand="1" w:val="04A0"/>
+        <w:tblInd w:w="250.0" w:type="dxa"/>
+      </w:tblPr>
+      <w:tblGrid>
+        <w:gridCol w:w="5402"/>
+        <w:gridCol w:w="5402"/>
+      </w:tblGrid>
+      <w:tr>
+        <w:trPr>
+          <w:trHeight w:hRule="exact" w:val="280"/>
+        </w:trPr>
+        <w:tc>
+          <w:tcPr>
+            <w:tcW w:type="dxa" w:w="9462"/>
+            <w:tcBorders/>
+            <w:tcMar>
+              <w:start w:w="0" w:type="dxa"/>
+              <w:end w:w="0" w:type="dxa"/>
+            </w:tcMar>
+          </w:tcPr>
+          <w:p>
+            <w:pPr>
+              <w:autoSpaceDN w:val="0"/>
+              <w:autoSpaceDE w:val="0"/>
+              <w:widowControl/>
+              <w:spacing w:line="240" w:lineRule="auto" w:before="26" w:after="0"/>
+              <w:ind w:left="284" w:right="0" w:firstLine="0"/>
+              <w:jc w:val="left"/>
+            </w:pPr>
+            <w:r>
+              <w:rPr>
+                <w:w w:val="97.74999618530273"/>
+                <w:rFonts w:ascii="Noto Sans" w:hAnsi="Noto Sans" w:eastAsia="Noto Sans"/>
+                <w:b/>
+                <w:i w:val="0"/>
+                <w:color w:val="1A1A1A"/>
+                <w:sz w:val="18"/>
+              </w:rPr>
+              <w:t>Overseas Technical Support Engineer (Semiconductor Equipment / Robotics · Hybrid) | Shenzhen</w:t>
+            </w:r>
+          </w:p>
+        </w:tc>
+        <w:tc>
+          <w:tcPr>
+            <w:tcW w:type="dxa" w:w="1066"/>
+            <w:tcBorders/>
+            <w:shd w:fill="fafafa"/>
+            <w:tcMar>
+              <w:start w:w="0" w:type="dxa"/>
+              <w:end w:w="0" w:type="dxa"/>
+            </w:tcMar>
+          </w:tcPr>
+          <w:p>
+            <w:pPr>
+              <w:autoSpaceDN w:val="0"/>
+              <w:autoSpaceDE w:val="0"/>
+              <w:widowControl/>
+              <w:spacing w:line="238" w:lineRule="auto" w:before="48" w:after="0"/>
+              <w:ind w:left="0" w:right="0" w:firstLine="0"/>
+              <w:jc w:val="center"/>
+            </w:pPr>
+            <w:r>
+              <w:rPr>
+                <w:rFonts w:ascii="Noto Sans" w:hAnsi="Noto Sans" w:eastAsia="Noto Sans"/>
+                <w:b w:val="0"/>
+                <w:i w:val="0"/>
+                <w:color w:val="999999"/>
+                <w:sz w:val="17"/>
+              </w:rPr>
+              <w:t>Photo</w:t>
+            </w:r>
+          </w:p>
+        </w:tc>
+      </w:tr>
+    </w:tbl>
+    <w:p>
+      <w:pPr>
+        <w:autoSpaceDN w:val="0"/>
+        <w:autoSpaceDE w:val="0"/>
+        <w:widowControl/>
+        <w:spacing w:line="245" w:lineRule="auto" w:before="0" w:after="0"/>
+        <w:ind w:left="576" w:right="1872" w:firstLine="0"/>
         <w:jc w:val="center"/>
       </w:pPr>
       <w:r>
         <w:rPr>
-          <w:rFonts w:ascii="Calibri" w:hAnsi="Calibri" w:eastAsia="微软雅黑"/>
-          <w:b/>
-          <w:sz w:val="40"/>
+          <w:w w:val="97.74999618530273"/>
+          <w:rFonts w:ascii="Noto Sans" w:hAnsi="Noto Sans" w:eastAsia="Noto Sans"/>
+          <w:b w:val="0"/>
+          <w:i w:val="0"/>
+          <w:color w:val="1A1A1A"/>
+          <w:sz w:val="18"/>
         </w:rPr>
-        <w:t>Zhongqi Hou</w:t>
+        <w:t xml:space="preserve">English-fluent | UK visa (~2 years) | Overseas travel OK (~3×/year, ~1 month) | +86 178-1676-9251 | </w:t>
+      </w:r>
+      <w:r>
+        <w:rPr>
+          <w:w w:val="97.74999618530273"/>
+          <w:rFonts w:ascii="Noto Sans" w:hAnsi="Noto Sans" w:eastAsia="Noto Sans"/>
+          <w:b w:val="0"/>
+          <w:i w:val="0"/>
+          <w:color w:val="1A1A1A"/>
+          <w:sz w:val="18"/>
+        </w:rPr>
+        <w:t>zhongqi_hou@foxmail.com</w:t>
       </w:r>
     </w:p>
     <w:p>
       <w:pPr>
-        <w:spacing w:before="0" w:after="40" w:line="276" w:lineRule="auto"/>
-        <w:jc w:val="center"/>
+        <w:autoSpaceDN w:val="0"/>
+        <w:autoSpaceDE w:val="0"/>
+        <w:widowControl/>
+        <w:spacing w:line="240" w:lineRule="auto" w:before="184" w:after="0"/>
+        <w:ind w:left="0" w:right="0" w:firstLine="0"/>
+        <w:jc w:val="left"/>
       </w:pPr>
       <w:r>
         <w:rPr>
-          <w:rFonts w:ascii="Calibri" w:hAnsi="Calibri" w:eastAsia="微软雅黑"/>
+          <w:rFonts w:ascii="Noto Sans" w:hAnsi="Noto Sans" w:eastAsia="Noto Sans"/>
           <w:b/>
+          <w:i w:val="0"/>
+          <w:color w:val="1A1A1A"/>
           <w:sz w:val="20"/>
-        </w:rPr>
-        <w:t>Overseas Technical Support Engineer (Semiconductor Equipment / Robotics · Hybrid) | Shenzhen</w:t>
-      </w:r>
-    </w:p>
-    <w:p>
-      <w:pPr>
-        <w:spacing w:before="0" w:after="80" w:line="276" w:lineRule="auto"/>
-        <w:jc w:val="center"/>
-      </w:pPr>
-      <w:r>
-        <w:rPr>
-          <w:rFonts w:ascii="Calibri" w:hAnsi="Calibri" w:eastAsia="微软雅黑"/>
-          <w:b w:val="0"/>
-          <w:sz w:val="19"/>
-        </w:rPr>
-        <w:t>English-fluent | UK visa (~2 years) | Overseas travel OK (~3×/year, ~1 month) | +86 178-1676-9251 | zhongqi_hou@foxmail.com</w:t>
-      </w:r>
-    </w:p>
-    <w:p>
-      <w:pPr>
-        <w:spacing w:before="160" w:after="40" w:line="264" w:lineRule="auto"/>
-        <w:pBdr>
-          <w:bottom w:val="single" w:sz="12" w:space="1" w:color="222222"/>
-        </w:pBdr>
-      </w:pPr>
-      <w:r>
-        <w:rPr>
-          <w:rFonts w:ascii="Calibri" w:hAnsi="Calibri" w:eastAsia="微软雅黑"/>
-          <w:b/>
-          <w:sz w:val="24"/>
         </w:rPr>
         <w:t>SUMMARY</w:t>
       </w:r>
     </w:p>
     <w:p>
       <w:pPr>
-        <w:spacing w:before="0" w:after="20" w:line="288" w:lineRule="auto"/>
+        <w:autoSpaceDN w:val="0"/>
+        <w:tabs>
+          <w:tab w:pos="184" w:val="left"/>
+        </w:tabs>
+        <w:autoSpaceDE w:val="0"/>
+        <w:widowControl/>
+        <w:spacing w:line="245" w:lineRule="auto" w:before="106" w:after="0"/>
+        <w:ind w:left="0" w:right="576" w:firstLine="0"/>
+        <w:jc w:val="left"/>
       </w:pPr>
       <w:r>
         <w:rPr>
-          <w:rFonts w:ascii="Calibri" w:hAnsi="Calibri" w:eastAsia="微软雅黑"/>
+          <w:w w:val="102.16666327582465"/>
+          <w:rFonts w:ascii="Noto Sans" w:hAnsi="Noto Sans" w:eastAsia="Noto Sans"/>
           <w:b w:val="0"/>
-          <w:sz w:val="19"/>
+          <w:i w:val="0"/>
+          <w:color w:val="1A1A1A"/>
+          <w:sz w:val="18"/>
         </w:rPr>
-        <w:t>• Europe field support (Spain / Netherlands / France / Germany) + remote overseas customers; clear spoken English for training and troubleshooting.</w:t>
+        <w:t xml:space="preserve">• Europe field support (Spain / Netherlands / France / Germany) + remote overseas customers; clear spoken English for </w:t>
+      </w:r>
+      <w:r>
+        <w:tab/>
+      </w:r>
+      <w:r>
+        <w:rPr>
+          <w:w w:val="102.16666327582465"/>
+          <w:rFonts w:ascii="Noto Sans" w:hAnsi="Noto Sans" w:eastAsia="Noto Sans"/>
+          <w:b w:val="0"/>
+          <w:i w:val="0"/>
+          <w:color w:val="1A1A1A"/>
+          <w:sz w:val="18"/>
+        </w:rPr>
+        <w:t>training and troubleshooting.</w:t>
       </w:r>
     </w:p>
     <w:p>
       <w:pPr>
-        <w:spacing w:before="0" w:after="20" w:line="288" w:lineRule="auto"/>
+        <w:autoSpaceDN w:val="0"/>
+        <w:tabs>
+          <w:tab w:pos="184" w:val="left"/>
+        </w:tabs>
+        <w:autoSpaceDE w:val="0"/>
+        <w:widowControl/>
+        <w:spacing w:line="245" w:lineRule="auto" w:before="0" w:after="0"/>
+        <w:ind w:left="0" w:right="576" w:firstLine="0"/>
+        <w:jc w:val="left"/>
       </w:pPr>
       <w:r>
         <w:rPr>
-          <w:rFonts w:ascii="Calibri" w:hAnsi="Calibri" w:eastAsia="微软雅黑"/>
+          <w:w w:val="102.16666327582465"/>
+          <w:rFonts w:ascii="Noto Sans" w:hAnsi="Noto Sans" w:eastAsia="Noto Sans"/>
           <w:b w:val="0"/>
-          <w:sz w:val="19"/>
+          <w:i w:val="0"/>
+          <w:color w:val="1A1A1A"/>
+          <w:sz w:val="18"/>
         </w:rPr>
-        <w:t>• Customer–R&amp;D bridge: drove key-account wheel-alignment HW/SW requirements for ~4 months through to product delivery.</w:t>
+        <w:t xml:space="preserve">• Customer–R&amp;D bridge: drove key-account wheel-alignment HW/SW requirements for ~4 months through to product </w:t>
+      </w:r>
+      <w:r>
+        <w:tab/>
+      </w:r>
+      <w:r>
+        <w:rPr>
+          <w:w w:val="102.16666327582465"/>
+          <w:rFonts w:ascii="Noto Sans" w:hAnsi="Noto Sans" w:eastAsia="Noto Sans"/>
+          <w:b w:val="0"/>
+          <w:i w:val="0"/>
+          <w:color w:val="1A1A1A"/>
+          <w:sz w:val="18"/>
+        </w:rPr>
+        <w:t>delivery.</w:t>
       </w:r>
     </w:p>
     <w:p>
       <w:pPr>
-        <w:spacing w:before="0" w:after="20" w:line="288" w:lineRule="auto"/>
+        <w:autoSpaceDN w:val="0"/>
+        <w:tabs>
+          <w:tab w:pos="184" w:val="left"/>
+        </w:tabs>
+        <w:autoSpaceDE w:val="0"/>
+        <w:widowControl/>
+        <w:spacing w:line="245" w:lineRule="auto" w:before="0" w:after="0"/>
+        <w:ind w:left="0" w:right="864" w:firstLine="0"/>
+        <w:jc w:val="left"/>
       </w:pPr>
       <w:r>
         <w:rPr>
-          <w:rFonts w:ascii="Calibri" w:hAnsi="Calibri" w:eastAsia="微软雅黑"/>
+          <w:w w:val="102.16666327582465"/>
+          <w:rFonts w:ascii="Noto Sans" w:hAnsi="Noto Sans" w:eastAsia="Noto Sans"/>
           <w:b w:val="0"/>
-          <w:sz w:val="19"/>
+          <w:i w:val="0"/>
+          <w:color w:val="1A1A1A"/>
+          <w:sz w:val="18"/>
         </w:rPr>
-        <w:t>• Built AI knowledge-base assistant (Cursor, 24/7 on company servers) and ticket/dashboard platform for after-sales efficiency across time zones.</w:t>
+        <w:t xml:space="preserve">• Built AI knowledge-base assistant (Cursor, 24/7 on company servers) and ticket/dashboard platform for after-sales </w:t>
+      </w:r>
+      <w:r>
+        <w:tab/>
+      </w:r>
+      <w:r>
+        <w:rPr>
+          <w:w w:val="102.16666327582465"/>
+          <w:rFonts w:ascii="Noto Sans" w:hAnsi="Noto Sans" w:eastAsia="Noto Sans"/>
+          <w:b w:val="0"/>
+          <w:i w:val="0"/>
+          <w:color w:val="1A1A1A"/>
+          <w:sz w:val="18"/>
+        </w:rPr>
+        <w:t>efficiency across time zones.</w:t>
       </w:r>
     </w:p>
     <w:p>
       <w:pPr>
-        <w:spacing w:before="0" w:after="20" w:line="288" w:lineRule="auto"/>
+        <w:autoSpaceDN w:val="0"/>
+        <w:autoSpaceDE w:val="0"/>
+        <w:widowControl/>
+        <w:spacing w:line="240" w:lineRule="auto" w:before="0" w:after="0"/>
+        <w:ind w:left="0" w:right="0" w:firstLine="0"/>
+        <w:jc w:val="left"/>
       </w:pPr>
       <w:r>
         <w:rPr>
-          <w:rFonts w:ascii="Calibri" w:hAnsi="Calibri" w:eastAsia="微软雅黑"/>
+          <w:w w:val="102.16666327582465"/>
+          <w:rFonts w:ascii="Noto Sans" w:hAnsi="Noto Sans" w:eastAsia="Noto Sans"/>
           <w:b w:val="0"/>
-          <w:sz w:val="19"/>
+          <w:i w:val="0"/>
+          <w:color w:val="1A1A1A"/>
+          <w:sz w:val="18"/>
         </w:rPr>
         <w:t>• Automation degree + smart-car lab (PCB, embedded C, sensors)—fast ramp-up on electromechanical equipment.</w:t>
       </w:r>
     </w:p>
     <w:p>
       <w:pPr>
-        <w:spacing w:before="160" w:after="40" w:line="264" w:lineRule="auto"/>
-        <w:pBdr>
-          <w:bottom w:val="single" w:sz="12" w:space="1" w:color="222222"/>
-        </w:pBdr>
+        <w:autoSpaceDN w:val="0"/>
+        <w:autoSpaceDE w:val="0"/>
+        <w:widowControl/>
+        <w:spacing w:line="240" w:lineRule="auto" w:before="62" w:after="46"/>
+        <w:ind w:left="0" w:right="0" w:firstLine="0"/>
+        <w:jc w:val="left"/>
       </w:pPr>
       <w:r>
         <w:rPr>
-          <w:rFonts w:ascii="Calibri" w:hAnsi="Calibri" w:eastAsia="微软雅黑"/>
+          <w:rFonts w:ascii="Noto Sans" w:hAnsi="Noto Sans" w:eastAsia="Noto Sans"/>
           <w:b/>
-          <w:sz w:val="24"/>
+          <w:i w:val="0"/>
+          <w:color w:val="1A1A1A"/>
+          <w:sz w:val="20"/>
         </w:rPr>
         <w:t>EXPERIENCE</w:t>
       </w:r>
     </w:p>
+    <w:tbl>
+      <w:tblPr>
+        <w:tblW w:type="auto" w:w="0"/>
+        <w:tblLayout w:type="fixed"/>
+        <w:tblLook w:firstColumn="1" w:firstRow="1" w:lastColumn="0" w:lastRow="0" w:noHBand="0" w:noVBand="1" w:val="04A0"/>
+        <w:tblInd w:w="0.0" w:type="dxa"/>
+      </w:tblPr>
+      <w:tblGrid>
+        <w:gridCol w:w="5402"/>
+        <w:gridCol w:w="5402"/>
+      </w:tblGrid>
+      <w:tr>
+        <w:trPr>
+          <w:trHeight w:hRule="exact" w:val="310"/>
+        </w:trPr>
+        <w:tc>
+          <w:tcPr>
+            <w:tcW w:type="dxa" w:w="8190"/>
+            <w:tcBorders>
+              <w:top w:sz="6.400000000000091" w:val="single" w:color="#212121"/>
+            </w:tcBorders>
+            <w:tcMar>
+              <w:start w:w="0" w:type="dxa"/>
+              <w:end w:w="0" w:type="dxa"/>
+            </w:tcMar>
+          </w:tcPr>
+          <w:p>
+            <w:pPr>
+              <w:autoSpaceDN w:val="0"/>
+              <w:autoSpaceDE w:val="0"/>
+              <w:widowControl/>
+              <w:spacing w:line="240" w:lineRule="auto" w:before="44" w:after="0"/>
+              <w:ind w:left="0" w:right="0" w:firstLine="0"/>
+              <w:jc w:val="left"/>
+            </w:pPr>
+            <w:r>
+              <w:rPr>
+                <w:w w:val="102.16666327582465"/>
+                <w:rFonts w:ascii="Noto Sans" w:hAnsi="Noto Sans" w:eastAsia="Noto Sans"/>
+                <w:b/>
+                <w:i w:val="0"/>
+                <w:color w:val="1A1A1A"/>
+                <w:sz w:val="18"/>
+              </w:rPr>
+              <w:t>SmartSafe (Yijian Intelligent) — Overseas Technical Support / Service Engineer</w:t>
+            </w:r>
+          </w:p>
+        </w:tc>
+        <w:tc>
+          <w:tcPr>
+            <w:tcW w:type="dxa" w:w="2596"/>
+            <w:tcBorders>
+              <w:top w:sz="6.400000000000091" w:val="single" w:color="#212121"/>
+            </w:tcBorders>
+            <w:tcMar>
+              <w:start w:w="0" w:type="dxa"/>
+              <w:end w:w="0" w:type="dxa"/>
+            </w:tcMar>
+          </w:tcPr>
+          <w:p>
+            <w:pPr>
+              <w:autoSpaceDN w:val="0"/>
+              <w:autoSpaceDE w:val="0"/>
+              <w:widowControl/>
+              <w:spacing w:line="240" w:lineRule="auto" w:before="56" w:after="0"/>
+              <w:ind w:left="0" w:right="2" w:firstLine="0"/>
+              <w:jc w:val="right"/>
+            </w:pPr>
+            <w:r>
+              <w:rPr>
+                <w:w w:val="101.11765020033891"/>
+                <w:rFonts w:ascii="Noto Sans" w:hAnsi="Noto Sans" w:eastAsia="Noto Sans"/>
+                <w:b w:val="0"/>
+                <w:i w:val="0"/>
+                <w:color w:val="555555"/>
+                <w:sz w:val="17"/>
+              </w:rPr>
+              <w:t>Nov 2025 – Present</w:t>
+            </w:r>
+          </w:p>
+        </w:tc>
+      </w:tr>
+    </w:tbl>
     <w:p>
       <w:pPr>
+        <w:autoSpaceDN w:val="0"/>
         <w:tabs>
-          <w:tab w:pos="9354" w:val="right"/>
+          <w:tab w:pos="184" w:val="left"/>
         </w:tabs>
-        <w:spacing w:before="100" w:after="20" w:line="276" w:lineRule="auto"/>
+        <w:autoSpaceDE w:val="0"/>
+        <w:widowControl/>
+        <w:spacing w:line="245" w:lineRule="auto" w:before="2" w:after="0"/>
+        <w:ind w:left="0" w:right="0" w:firstLine="0"/>
+        <w:jc w:val="left"/>
       </w:pPr>
       <w:r>
         <w:rPr>
-          <w:rFonts w:ascii="Calibri" w:hAnsi="Calibri" w:eastAsia="微软雅黑"/>
-          <w:b/>
-          <w:sz w:val="21"/>
+          <w:w w:val="101.11765020033891"/>
+          <w:rFonts w:ascii="Noto Sans" w:hAnsi="Noto Sans" w:eastAsia="Noto Sans"/>
+          <w:b w:val="0"/>
+          <w:i w:val="0"/>
+          <w:color w:val="444444"/>
+          <w:sz w:val="17"/>
         </w:rPr>
-        <w:t>SmartSafe (Yijian Intelligent) — Overseas Technical Support / Service Engineer</w:t>
+        <w:t>Automotive aftermarket test &amp; maintenance equipment | Pre-sales training, after-sales, customer–R&amp;D coordination</w:t>
+      </w:r>
+      <w:r>
+        <w:br/>
       </w:r>
       <w:r>
         <w:rPr>
-          <w:rFonts w:ascii="Calibri" w:hAnsi="Calibri" w:eastAsia="微软雅黑"/>
+          <w:w w:val="102.16666327582465"/>
+          <w:rFonts w:ascii="Noto Sans" w:hAnsi="Noto Sans" w:eastAsia="Noto Sans"/>
           <w:b w:val="0"/>
-          <w:color w:val="555555"/>
-          <w:sz w:val="20"/>
+          <w:i w:val="0"/>
+          <w:color w:val="1A1A1A"/>
+          <w:sz w:val="18"/>
         </w:rPr>
+        <w:t xml:space="preserve">• Multi-line support: wheel alignment, ADAS calibration, A/C refrigerant exchange, injector cleaning, ATF exchange, EV battery </w:t>
+      </w:r>
+      <w:r>
         <w:tab/>
-        <w:t>Nov 2025 – Present</w:t>
+      </w:r>
+      <w:r>
+        <w:rPr>
+          <w:w w:val="102.16666327582465"/>
+          <w:rFonts w:ascii="Noto Sans" w:hAnsi="Noto Sans" w:eastAsia="Noto Sans"/>
+          <w:b w:val="0"/>
+          <w:i w:val="0"/>
+          <w:color w:val="1A1A1A"/>
+          <w:sz w:val="18"/>
+        </w:rPr>
+        <w:t>pack charge/discharge &amp; balancing, diagnostic tablets.</w:t>
       </w:r>
     </w:p>
     <w:p>
       <w:pPr>
-        <w:spacing w:before="0" w:after="20" w:line="276" w:lineRule="auto"/>
+        <w:autoSpaceDN w:val="0"/>
+        <w:autoSpaceDE w:val="0"/>
+        <w:widowControl/>
+        <w:spacing w:line="240" w:lineRule="auto" w:before="6" w:after="0"/>
+        <w:ind w:left="0" w:right="0" w:firstLine="0"/>
+        <w:jc w:val="left"/>
       </w:pPr>
       <w:r>
         <w:rPr>
-          <w:rFonts w:ascii="Calibri" w:hAnsi="Calibri" w:eastAsia="微软雅黑"/>
+          <w:w w:val="102.16666327582465"/>
+          <w:rFonts w:ascii="Noto Sans" w:hAnsi="Noto Sans" w:eastAsia="Noto Sans"/>
           <w:b w:val="0"/>
-          <w:color w:val="555555"/>
-          <w:sz w:val="19"/>
-        </w:rPr>
-        <w:t>Automotive aftermarket test &amp; maintenance equipment | Pre-sales training, after-sales, customer–R&amp;D coordination</w:t>
-      </w:r>
-    </w:p>
-    <w:p>
-      <w:pPr>
-        <w:spacing w:before="0" w:after="20" w:line="288" w:lineRule="auto"/>
-      </w:pPr>
-      <w:r>
-        <w:rPr>
-          <w:rFonts w:ascii="Calibri" w:hAnsi="Calibri" w:eastAsia="微软雅黑"/>
-          <w:b w:val="0"/>
-          <w:sz w:val="19"/>
-        </w:rPr>
-        <w:t>• Multi-line support: wheel alignment, ADAS calibration, A/C refrigerant exchange, injector cleaning, ATF exchange, EV battery pack charge/discharge &amp; balancing, diagnostic tablets.</w:t>
-      </w:r>
-    </w:p>
-    <w:p>
-      <w:pPr>
-        <w:spacing w:before="0" w:after="20" w:line="288" w:lineRule="auto"/>
-      </w:pPr>
-      <w:r>
-        <w:rPr>
-          <w:rFonts w:ascii="Calibri" w:hAnsi="Calibri" w:eastAsia="微软雅黑"/>
-          <w:b w:val="0"/>
-          <w:sz w:val="19"/>
+          <w:i w:val="0"/>
+          <w:color w:val="1A1A1A"/>
+          <w:sz w:val="18"/>
         </w:rPr>
         <w:t>• On-site in ES/NL/FR/DE for fault handling, product training, and dealer/end-user enablement.</w:t>
       </w:r>
     </w:p>
     <w:p>
       <w:pPr>
-        <w:spacing w:before="0" w:after="20" w:line="288" w:lineRule="auto"/>
+        <w:autoSpaceDN w:val="0"/>
+        <w:autoSpaceDE w:val="0"/>
+        <w:widowControl/>
+        <w:spacing w:line="240" w:lineRule="auto" w:before="4" w:after="0"/>
+        <w:ind w:left="0" w:right="0" w:firstLine="0"/>
+        <w:jc w:val="left"/>
       </w:pPr>
       <w:r>
         <w:rPr>
-          <w:rFonts w:ascii="Calibri" w:hAnsi="Calibri" w:eastAsia="微软雅黑"/>
+          <w:w w:val="102.16666327582465"/>
+          <w:rFonts w:ascii="Noto Sans" w:hAnsi="Noto Sans" w:eastAsia="Noto Sans"/>
           <w:b w:val="0"/>
-          <w:sz w:val="19"/>
+          <w:i w:val="0"/>
+          <w:color w:val="1A1A1A"/>
+          <w:sz w:val="18"/>
         </w:rPr>
         <w:t>• Led ~4-month key-account wheel-alignment HW/SW alignment between customer and R&amp;D until delivery landed.</w:t>
       </w:r>
     </w:p>
     <w:p>
       <w:pPr>
-        <w:spacing w:before="0" w:after="20" w:line="288" w:lineRule="auto"/>
+        <w:autoSpaceDN w:val="0"/>
+        <w:tabs>
+          <w:tab w:pos="184" w:val="left"/>
+        </w:tabs>
+        <w:autoSpaceDE w:val="0"/>
+        <w:widowControl/>
+        <w:spacing w:line="245" w:lineRule="auto" w:before="6" w:after="0"/>
+        <w:ind w:left="0" w:right="288" w:firstLine="0"/>
+        <w:jc w:val="left"/>
       </w:pPr>
       <w:r>
         <w:rPr>
-          <w:rFonts w:ascii="Calibri" w:hAnsi="Calibri" w:eastAsia="微软雅黑"/>
+          <w:w w:val="102.16666327582465"/>
+          <w:rFonts w:ascii="Noto Sans" w:hAnsi="Noto Sans" w:eastAsia="Noto Sans"/>
           <w:b w:val="0"/>
-          <w:sz w:val="19"/>
+          <w:i w:val="0"/>
+          <w:color w:val="1A1A1A"/>
+          <w:sz w:val="18"/>
         </w:rPr>
-        <w:t>• Built department AI knowledge base (FAQ + docs, chat Q&amp;A) with Cursor; 24/7 server deploy for sales/service; built ticket platform with media upload + issue dashboard.</w:t>
+        <w:t xml:space="preserve">• Built department AI knowledge base (FAQ + docs, chat Q&amp;A) with Cursor; 24/7 server deploy for sales/service; built ticket </w:t>
+      </w:r>
+      <w:r>
+        <w:tab/>
+      </w:r>
+      <w:r>
+        <w:rPr>
+          <w:w w:val="102.16666327582465"/>
+          <w:rFonts w:ascii="Noto Sans" w:hAnsi="Noto Sans" w:eastAsia="Noto Sans"/>
+          <w:b w:val="0"/>
+          <w:i w:val="0"/>
+          <w:color w:val="1A1A1A"/>
+          <w:sz w:val="18"/>
+        </w:rPr>
+        <w:t>platform with media upload + issue dashboard.</w:t>
       </w:r>
     </w:p>
     <w:p>
       <w:pPr>
+        <w:autoSpaceDN w:val="0"/>
         <w:tabs>
-          <w:tab w:pos="9354" w:val="right"/>
+          <w:tab w:pos="9134" w:val="left"/>
         </w:tabs>
-        <w:spacing w:before="100" w:after="20" w:line="276" w:lineRule="auto"/>
+        <w:autoSpaceDE w:val="0"/>
+        <w:widowControl/>
+        <w:spacing w:line="240" w:lineRule="auto" w:before="34" w:after="0"/>
+        <w:ind w:left="0" w:right="0" w:firstLine="0"/>
+        <w:jc w:val="left"/>
       </w:pPr>
       <w:r>
         <w:rPr>
-          <w:rFonts w:ascii="Calibri" w:hAnsi="Calibri" w:eastAsia="微软雅黑"/>
+          <w:w w:val="102.16666327582465"/>
+          <w:rFonts w:ascii="Noto Sans" w:hAnsi="Noto Sans" w:eastAsia="Noto Sans"/>
           <w:b/>
-          <w:sz w:val="21"/>
+          <w:i w:val="0"/>
+          <w:color w:val="1A1A1A"/>
+          <w:sz w:val="18"/>
         </w:rPr>
-        <w:t>ELEGOO (Shenzhen Zhinenpai Technology) — Overseas Technical Support Engineer</w:t>
+        <w:t xml:space="preserve">ELEGOO (Shenzhen Zhinenpai Technology) — Overseas Technical Support Engineer </w:t>
+      </w:r>
+      <w:r>
+        <w:tab/>
       </w:r>
       <w:r>
         <w:rPr>
-          <w:rFonts w:ascii="Calibri" w:hAnsi="Calibri" w:eastAsia="微软雅黑"/>
+          <w:w w:val="101.11765020033891"/>
+          <w:rFonts w:ascii="Noto Sans" w:hAnsi="Noto Sans" w:eastAsia="Noto Sans"/>
           <w:b w:val="0"/>
+          <w:i w:val="0"/>
           <w:color w:val="555555"/>
-          <w:sz w:val="20"/>
+          <w:sz w:val="17"/>
         </w:rPr>
-        <w:tab/>
         <w:t>Aug 2025 – Oct 2025</w:t>
       </w:r>
     </w:p>
     <w:p>
       <w:pPr>
-        <w:spacing w:before="0" w:after="20" w:line="276" w:lineRule="auto"/>
+        <w:autoSpaceDN w:val="0"/>
+        <w:tabs>
+          <w:tab w:pos="184" w:val="left"/>
+        </w:tabs>
+        <w:autoSpaceDE w:val="0"/>
+        <w:widowControl/>
+        <w:spacing w:line="245" w:lineRule="auto" w:before="18" w:after="0"/>
+        <w:ind w:left="0" w:right="720" w:firstLine="0"/>
+        <w:jc w:val="left"/>
       </w:pPr>
       <w:r>
         <w:rPr>
-          <w:rFonts w:ascii="Calibri" w:hAnsi="Calibri" w:eastAsia="微软雅黑"/>
+          <w:w w:val="101.11765020033891"/>
+          <w:rFonts w:ascii="Noto Sans" w:hAnsi="Noto Sans" w:eastAsia="Noto Sans"/>
           <w:b w:val="0"/>
-          <w:color w:val="555555"/>
-          <w:sz w:val="19"/>
+          <w:i w:val="0"/>
+          <w:color w:val="444444"/>
+          <w:sz w:val="17"/>
         </w:rPr>
         <w:t>3D printing export | Remote EU/US technical support</w:t>
+      </w:r>
+      <w:r>
+        <w:br/>
+      </w:r>
+      <w:r>
+        <w:rPr>
+          <w:w w:val="102.16666327582465"/>
+          <w:rFonts w:ascii="Noto Sans" w:hAnsi="Noto Sans" w:eastAsia="Noto Sans"/>
+          <w:b w:val="0"/>
+          <w:i w:val="0"/>
+          <w:color w:val="1A1A1A"/>
+          <w:sz w:val="18"/>
+        </w:rPr>
+        <w:t xml:space="preserve">• Independent EU/US technical inquiry handling; personal knowledge base + AI agent for faster response; structured </w:t>
+      </w:r>
+      <w:r>
+        <w:tab/>
+      </w:r>
+      <w:r>
+        <w:rPr>
+          <w:w w:val="102.16666327582465"/>
+          <w:rFonts w:ascii="Noto Sans" w:hAnsi="Noto Sans" w:eastAsia="Noto Sans"/>
+          <w:b w:val="0"/>
+          <w:i w:val="0"/>
+          <w:color w:val="1A1A1A"/>
+          <w:sz w:val="18"/>
+        </w:rPr>
+        <w:t>feedback to product/engineering.</w:t>
       </w:r>
     </w:p>
     <w:p>
       <w:pPr>
-        <w:spacing w:before="0" w:after="20" w:line="288" w:lineRule="auto"/>
+        <w:autoSpaceDN w:val="0"/>
+        <w:autoSpaceDE w:val="0"/>
+        <w:widowControl/>
+        <w:spacing w:line="240" w:lineRule="auto" w:before="78" w:after="32"/>
+        <w:ind w:left="0" w:right="0" w:firstLine="0"/>
+        <w:jc w:val="left"/>
       </w:pPr>
       <w:r>
         <w:rPr>
-          <w:rFonts w:ascii="Calibri" w:hAnsi="Calibri" w:eastAsia="微软雅黑"/>
+          <w:rFonts w:ascii="Noto Sans" w:hAnsi="Noto Sans" w:eastAsia="Noto Sans"/>
+          <w:b/>
+          <w:i w:val="0"/>
+          <w:color w:val="1A1A1A"/>
+          <w:sz w:val="20"/>
+        </w:rPr>
+        <w:t>EDUCATION</w:t>
+      </w:r>
+    </w:p>
+    <w:tbl>
+      <w:tblPr>
+        <w:tblW w:type="auto" w:w="0"/>
+        <w:tblLayout w:type="fixed"/>
+        <w:tblLook w:firstColumn="1" w:firstRow="1" w:lastColumn="0" w:lastRow="0" w:noHBand="0" w:noVBand="1" w:val="04A0"/>
+        <w:tblInd w:w="0.0" w:type="dxa"/>
+      </w:tblPr>
+      <w:tblGrid>
+        <w:gridCol w:w="5402"/>
+        <w:gridCol w:w="5402"/>
+      </w:tblGrid>
+      <w:tr>
+        <w:trPr>
+          <w:trHeight w:hRule="exact" w:val="304"/>
+        </w:trPr>
+        <w:tc>
+          <w:tcPr>
+            <w:tcW w:type="dxa" w:w="8530"/>
+            <w:tcBorders>
+              <w:top w:sz="5.599999999999909" w:val="single" w:color="#212121"/>
+            </w:tcBorders>
+            <w:tcMar>
+              <w:start w:w="0" w:type="dxa"/>
+              <w:end w:w="0" w:type="dxa"/>
+            </w:tcMar>
+          </w:tcPr>
+          <w:p>
+            <w:pPr>
+              <w:autoSpaceDN w:val="0"/>
+              <w:autoSpaceDE w:val="0"/>
+              <w:widowControl/>
+              <w:spacing w:line="240" w:lineRule="auto" w:before="44" w:after="0"/>
+              <w:ind w:left="0" w:right="0" w:firstLine="0"/>
+              <w:jc w:val="left"/>
+            </w:pPr>
+            <w:r>
+              <w:rPr>
+                <w:w w:val="102.16666327582465"/>
+                <w:rFonts w:ascii="Noto Sans" w:hAnsi="Noto Sans" w:eastAsia="Noto Sans"/>
+                <w:b/>
+                <w:i w:val="0"/>
+                <w:color w:val="1A1A1A"/>
+                <w:sz w:val="18"/>
+              </w:rPr>
+              <w:t>Zhejiang University of Science and Technology — B.E. Automation | GPA 3.04 (Top 15%)</w:t>
+            </w:r>
+          </w:p>
+        </w:tc>
+        <w:tc>
+          <w:tcPr>
+            <w:tcW w:type="dxa" w:w="2256"/>
+            <w:tcBorders>
+              <w:top w:sz="5.599999999999909" w:val="single" w:color="#212121"/>
+            </w:tcBorders>
+            <w:tcMar>
+              <w:start w:w="0" w:type="dxa"/>
+              <w:end w:w="0" w:type="dxa"/>
+            </w:tcMar>
+          </w:tcPr>
+          <w:p>
+            <w:pPr>
+              <w:autoSpaceDN w:val="0"/>
+              <w:autoSpaceDE w:val="0"/>
+              <w:widowControl/>
+              <w:spacing w:line="240" w:lineRule="auto" w:before="56" w:after="0"/>
+              <w:ind w:left="0" w:right="0" w:firstLine="0"/>
+              <w:jc w:val="right"/>
+            </w:pPr>
+            <w:r>
+              <w:rPr>
+                <w:w w:val="101.11765020033891"/>
+                <w:rFonts w:ascii="Noto Sans" w:hAnsi="Noto Sans" w:eastAsia="Noto Sans"/>
+                <w:b w:val="0"/>
+                <w:i w:val="0"/>
+                <w:color w:val="555555"/>
+                <w:sz w:val="17"/>
+              </w:rPr>
+              <w:t>Sep 2021 – Jun 2025</w:t>
+            </w:r>
+          </w:p>
+        </w:tc>
+      </w:tr>
+    </w:tbl>
+    <w:p>
+      <w:pPr>
+        <w:autoSpaceDN w:val="0"/>
+        <w:tabs>
+          <w:tab w:pos="184" w:val="left"/>
+        </w:tabs>
+        <w:autoSpaceDE w:val="0"/>
+        <w:widowControl/>
+        <w:spacing w:line="245" w:lineRule="auto" w:before="0" w:after="0"/>
+        <w:ind w:left="0" w:right="432" w:firstLine="0"/>
+        <w:jc w:val="left"/>
+      </w:pPr>
+      <w:r>
+        <w:rPr>
+          <w:w w:val="102.16666327582465"/>
+          <w:rFonts w:ascii="Noto Sans" w:hAnsi="Noto Sans" w:eastAsia="Noto Sans"/>
           <w:b w:val="0"/>
-          <w:sz w:val="19"/>
+          <w:i w:val="0"/>
+          <w:color w:val="1A1A1A"/>
+          <w:sz w:val="18"/>
         </w:rPr>
-        <w:t>• Independent EU/US technical inquiry handling; personal knowledge base + AI agent for faster response; structured feedback to product/engineering.</w:t>
+        <w:t xml:space="preserve">• Intelligent Vehicle Lab (3 yrs): Infineon TC264/TC377 GPS+IMU vehicle; Provincial 2nd Prize, National Intelligent Vehicle </w:t>
+      </w:r>
+      <w:r>
+        <w:tab/>
+      </w:r>
+      <w:r>
+        <w:rPr>
+          <w:w w:val="102.16666327582465"/>
+          <w:rFonts w:ascii="Noto Sans" w:hAnsi="Noto Sans" w:eastAsia="Noto Sans"/>
+          <w:b w:val="0"/>
+          <w:i w:val="0"/>
+          <w:color w:val="1A1A1A"/>
+          <w:sz w:val="18"/>
+        </w:rPr>
+        <w:t>Competition (4th in Zhejiang).</w:t>
       </w:r>
     </w:p>
     <w:p>
       <w:pPr>
-        <w:spacing w:before="160" w:after="40" w:line="264" w:lineRule="auto"/>
-        <w:pBdr>
-          <w:bottom w:val="single" w:sz="12" w:space="1" w:color="222222"/>
-        </w:pBdr>
+        <w:autoSpaceDN w:val="0"/>
+        <w:autoSpaceDE w:val="0"/>
+        <w:widowControl/>
+        <w:spacing w:line="240" w:lineRule="auto" w:before="0" w:after="0"/>
+        <w:ind w:left="0" w:right="0" w:firstLine="0"/>
+        <w:jc w:val="left"/>
       </w:pPr>
       <w:r>
         <w:rPr>
-          <w:rFonts w:ascii="Calibri" w:hAnsi="Calibri" w:eastAsia="微软雅黑"/>
-          <w:b/>
-          <w:sz w:val="24"/>
-        </w:rPr>
-        <w:t>EDUCATION</w:t>
-      </w:r>
-    </w:p>
-    <w:p>
-      <w:pPr>
-        <w:tabs>
-          <w:tab w:pos="9354" w:val="right"/>
-        </w:tabs>
-        <w:spacing w:before="100" w:after="20" w:line="276" w:lineRule="auto"/>
-      </w:pPr>
-      <w:r>
-        <w:rPr>
-          <w:rFonts w:ascii="Calibri" w:hAnsi="Calibri" w:eastAsia="微软雅黑"/>
-          <w:b/>
-          <w:sz w:val="21"/>
-        </w:rPr>
-        <w:t>Zhejiang University of Science and Technology — B.E. Automation | GPA 3.04 (Top 15%)</w:t>
-      </w:r>
-      <w:r>
-        <w:rPr>
-          <w:rFonts w:ascii="Calibri" w:hAnsi="Calibri" w:eastAsia="微软雅黑"/>
+          <w:w w:val="102.16666327582465"/>
+          <w:rFonts w:ascii="Noto Sans" w:hAnsi="Noto Sans" w:eastAsia="Noto Sans"/>
           <w:b w:val="0"/>
-          <w:color w:val="555555"/>
-          <w:sz w:val="20"/>
-        </w:rPr>
-        <w:tab/>
-        <w:t>Sep 2021 – Jun 2025</w:t>
-      </w:r>
-    </w:p>
-    <w:p>
-      <w:pPr>
-        <w:spacing w:before="0" w:after="20" w:line="288" w:lineRule="auto"/>
-      </w:pPr>
-      <w:r>
-        <w:rPr>
-          <w:rFonts w:ascii="Calibri" w:hAnsi="Calibri" w:eastAsia="微软雅黑"/>
-          <w:b w:val="0"/>
-          <w:sz w:val="19"/>
-        </w:rPr>
-        <w:t>• Intelligent Vehicle Lab (3 yrs): Infineon TC264/TC377 GPS+IMU vehicle; Provincial 2nd Prize, National Intelligent Vehicle Competition (4th in Zhejiang).</w:t>
-      </w:r>
-    </w:p>
-    <w:p>
-      <w:pPr>
-        <w:spacing w:before="0" w:after="20" w:line="288" w:lineRule="auto"/>
-      </w:pPr>
-      <w:r>
-        <w:rPr>
-          <w:rFonts w:ascii="Calibri" w:hAnsi="Calibri" w:eastAsia="微软雅黑"/>
-          <w:b w:val="0"/>
-          <w:sz w:val="19"/>
+          <w:i w:val="0"/>
+          <w:color w:val="1A1A1A"/>
+          <w:sz w:val="18"/>
         </w:rPr>
         <w:t>• STM32 / sensor drivers / UART·SPI / FreeRTOS basics; PCB reading, soldering, multimeter, embedded C.</w:t>
       </w:r>
     </w:p>
     <w:p>
       <w:pPr>
-        <w:spacing w:before="160" w:after="40" w:line="264" w:lineRule="auto"/>
-        <w:pBdr>
-          <w:bottom w:val="single" w:sz="12" w:space="1" w:color="222222"/>
-        </w:pBdr>
+        <w:autoSpaceDN w:val="0"/>
+        <w:autoSpaceDE w:val="0"/>
+        <w:widowControl/>
+        <w:spacing w:line="240" w:lineRule="auto" w:before="62" w:after="0"/>
+        <w:ind w:left="0" w:right="0" w:firstLine="0"/>
+        <w:jc w:val="left"/>
       </w:pPr>
       <w:r>
         <w:rPr>
-          <w:rFonts w:ascii="Calibri" w:hAnsi="Calibri" w:eastAsia="微软雅黑"/>
+          <w:rFonts w:ascii="Noto Sans" w:hAnsi="Noto Sans" w:eastAsia="Noto Sans"/>
           <w:b/>
-          <w:sz w:val="24"/>
+          <w:i w:val="0"/>
+          <w:color w:val="1A1A1A"/>
+          <w:sz w:val="20"/>
         </w:rPr>
         <w:t>SKILLS &amp; AWARDS</w:t>
       </w:r>
     </w:p>
     <w:p>
       <w:pPr>
-        <w:spacing w:before="0" w:after="20" w:line="288" w:lineRule="auto"/>
+        <w:autoSpaceDN w:val="0"/>
+        <w:autoSpaceDE w:val="0"/>
+        <w:widowControl/>
+        <w:spacing w:line="240" w:lineRule="auto" w:before="106" w:after="0"/>
+        <w:ind w:left="0" w:right="0" w:firstLine="0"/>
+        <w:jc w:val="left"/>
       </w:pPr>
       <w:r>
         <w:rPr>
-          <w:rFonts w:ascii="Calibri" w:hAnsi="Calibri" w:eastAsia="微软雅黑"/>
+          <w:w w:val="102.16666327582465"/>
+          <w:rFonts w:ascii="Noto Sans" w:hAnsi="Noto Sans" w:eastAsia="Noto Sans"/>
           <w:b w:val="0"/>
-          <w:sz w:val="19"/>
+          <w:i w:val="0"/>
+          <w:color w:val="1A1A1A"/>
+          <w:sz w:val="18"/>
         </w:rPr>
-        <w:t>• Languages: CET-6 English — overseas calls, on-site training, technical email.</w:t>
+        <w:t>Languages: CET-6 English — overseas calls, on-site training, technical email.</w:t>
       </w:r>
     </w:p>
     <w:p>
       <w:pPr>
-        <w:spacing w:before="0" w:after="20" w:line="288" w:lineRule="auto"/>
+        <w:autoSpaceDN w:val="0"/>
+        <w:autoSpaceDE w:val="0"/>
+        <w:widowControl/>
+        <w:spacing w:line="240" w:lineRule="auto" w:before="20" w:after="0"/>
+        <w:ind w:left="0" w:right="0" w:firstLine="0"/>
+        <w:jc w:val="left"/>
       </w:pPr>
       <w:r>
         <w:rPr>
-          <w:rFonts w:ascii="Calibri" w:hAnsi="Calibri" w:eastAsia="微软雅黑"/>
+          <w:w w:val="102.16666327582465"/>
+          <w:rFonts w:ascii="Noto Sans" w:hAnsi="Noto Sans" w:eastAsia="Noto Sans"/>
           <w:b w:val="0"/>
-          <w:sz w:val="19"/>
+          <w:i w:val="0"/>
+          <w:color w:val="1A1A1A"/>
+          <w:sz w:val="18"/>
         </w:rPr>
-        <w:t>• Support: multi-product diagnosis, pre-sales training, requirement translation, customer ↔ R&amp;D ↔ sales coordination.</w:t>
+        <w:t xml:space="preserve">Support: multi-product diagnosis, pre-sales training, requirement translation, customer </w:t>
+      </w:r>
+      <w:r>
+        <w:rPr>
+          <w:w w:val="102.16666327582465"/>
+          <w:rFonts w:ascii="Liberation Sans" w:hAnsi="Liberation Sans" w:eastAsia="Liberation Sans"/>
+          <w:b w:val="0"/>
+          <w:i w:val="0"/>
+          <w:color w:val="1A1A1A"/>
+          <w:sz w:val="18"/>
+        </w:rPr>
+        <w:t>↔</w:t>
+      </w:r>
+      <w:r>
+        <w:rPr>
+          <w:w w:val="102.16666327582465"/>
+          <w:rFonts w:ascii="Noto Sans" w:hAnsi="Noto Sans" w:eastAsia="Noto Sans"/>
+          <w:b w:val="0"/>
+          <w:i w:val="0"/>
+          <w:color w:val="1A1A1A"/>
+          <w:sz w:val="18"/>
+        </w:rPr>
+        <w:t xml:space="preserve"> R&amp;D </w:t>
+      </w:r>
+      <w:r>
+        <w:rPr>
+          <w:w w:val="102.16666327582465"/>
+          <w:rFonts w:ascii="Liberation Sans" w:hAnsi="Liberation Sans" w:eastAsia="Liberation Sans"/>
+          <w:b w:val="0"/>
+          <w:i w:val="0"/>
+          <w:color w:val="1A1A1A"/>
+          <w:sz w:val="18"/>
+        </w:rPr>
+        <w:t>↔</w:t>
+      </w:r>
+      <w:r>
+        <w:rPr>
+          <w:w w:val="102.16666327582465"/>
+          <w:rFonts w:ascii="Noto Sans" w:hAnsi="Noto Sans" w:eastAsia="Noto Sans"/>
+          <w:b w:val="0"/>
+          <w:i w:val="0"/>
+          <w:color w:val="1A1A1A"/>
+          <w:sz w:val="18"/>
+        </w:rPr>
+        <w:t xml:space="preserve"> sales coordination.</w:t>
       </w:r>
     </w:p>
     <w:p>
       <w:pPr>
-        <w:spacing w:before="0" w:after="20" w:line="288" w:lineRule="auto"/>
+        <w:autoSpaceDN w:val="0"/>
+        <w:autoSpaceDE w:val="0"/>
+        <w:widowControl/>
+        <w:spacing w:line="245" w:lineRule="auto" w:before="4" w:after="0"/>
+        <w:ind w:left="0" w:right="720" w:firstLine="0"/>
+        <w:jc w:val="left"/>
       </w:pPr>
       <w:r>
         <w:rPr>
-          <w:rFonts w:ascii="Calibri" w:hAnsi="Calibri" w:eastAsia="微软雅黑"/>
+          <w:w w:val="102.16666327582465"/>
+          <w:rFonts w:ascii="Noto Sans" w:hAnsi="Noto Sans" w:eastAsia="Noto Sans"/>
           <w:b w:val="0"/>
-          <w:sz w:val="19"/>
+          <w:i w:val="0"/>
+          <w:color w:val="1A1A1A"/>
+          <w:sz w:val="18"/>
         </w:rPr>
-        <w:t>• Technical: automation/embedded base; Python/Matlab; Cursor/AI tooling; knowledge-base &amp; ticket workflows. Prefer Shenzhen base.</w:t>
+        <w:t xml:space="preserve">Technical: automation/embedded base; Python/Matlab; Cursor/AI tooling; knowledge-base &amp; ticket workflows. Prefer </w:t>
+      </w:r>
+      <w:r>
+        <w:rPr>
+          <w:w w:val="102.16666327582465"/>
+          <w:rFonts w:ascii="Noto Sans" w:hAnsi="Noto Sans" w:eastAsia="Noto Sans"/>
+          <w:b w:val="0"/>
+          <w:i w:val="0"/>
+          <w:color w:val="1A1A1A"/>
+          <w:sz w:val="18"/>
+        </w:rPr>
+        <w:t>Shenzhen base.</w:t>
       </w:r>
     </w:p>
     <w:p>
       <w:pPr>
-        <w:spacing w:before="0" w:after="20" w:line="288" w:lineRule="auto"/>
+        <w:autoSpaceDN w:val="0"/>
+        <w:autoSpaceDE w:val="0"/>
+        <w:widowControl/>
+        <w:spacing w:line="245" w:lineRule="auto" w:before="4" w:after="0"/>
+        <w:ind w:left="0" w:right="144" w:firstLine="0"/>
+        <w:jc w:val="left"/>
       </w:pPr>
       <w:r>
         <w:rPr>
-          <w:rFonts w:ascii="Calibri" w:hAnsi="Calibri" w:eastAsia="微软雅黑"/>
+          <w:w w:val="102.16666327582465"/>
+          <w:rFonts w:ascii="Noto Sans" w:hAnsi="Noto Sans" w:eastAsia="Noto Sans"/>
           <w:b w:val="0"/>
-          <w:sz w:val="19"/>
+          <w:i w:val="0"/>
+          <w:color w:val="1A1A1A"/>
+          <w:sz w:val="18"/>
         </w:rPr>
-        <w:t>• Awards: Provincial 2nd Prize, National Intelligent Vehicle Competition (2023); Campus 1st, Zhejiang College English Contest (2022); National 3rd, Puyi English Writing (2023); scholarships (7/92).</w:t>
+        <w:t xml:space="preserve">Awards: Provincial 2nd Prize, National Intelligent Vehicle Competition (2023); Campus 1st, Zhejiang College English Contest </w:t>
+      </w:r>
+      <w:r>
+        <w:rPr>
+          <w:w w:val="102.16666327582465"/>
+          <w:rFonts w:ascii="Noto Sans" w:hAnsi="Noto Sans" w:eastAsia="Noto Sans"/>
+          <w:b w:val="0"/>
+          <w:i w:val="0"/>
+          <w:color w:val="1A1A1A"/>
+          <w:sz w:val="18"/>
+        </w:rPr>
+        <w:t>(2022); National 3rd, Puyi English Writing (2023); scholarships (7/92).</w:t>
       </w:r>
     </w:p>
     <w:p>
       <w:pPr>
-        <w:spacing w:before="160" w:after="40" w:line="264" w:lineRule="auto"/>
-        <w:pBdr>
-          <w:bottom w:val="single" w:sz="12" w:space="1" w:color="222222"/>
-        </w:pBdr>
+        <w:autoSpaceDN w:val="0"/>
+        <w:autoSpaceDE w:val="0"/>
+        <w:widowControl/>
+        <w:spacing w:line="240" w:lineRule="auto" w:before="78" w:after="0"/>
+        <w:ind w:left="0" w:right="0" w:firstLine="0"/>
+        <w:jc w:val="left"/>
       </w:pPr>
       <w:r>
         <w:rPr>
-          <w:rFonts w:ascii="Calibri" w:hAnsi="Calibri" w:eastAsia="微软雅黑"/>
+          <w:rFonts w:ascii="Noto Sans" w:hAnsi="Noto Sans" w:eastAsia="Noto Sans"/>
           <w:b/>
-          <w:sz w:val="24"/>
+          <w:i w:val="0"/>
+          <w:color w:val="1A1A1A"/>
+          <w:sz w:val="20"/>
         </w:rPr>
         <w:t>PROFILE</w:t>
       </w:r>
     </w:p>
     <w:p>
       <w:pPr>
-        <w:spacing w:before="0" w:after="40" w:line="276" w:lineRule="auto"/>
+        <w:autoSpaceDN w:val="0"/>
+        <w:autoSpaceDE w:val="0"/>
+        <w:widowControl/>
+        <w:spacing w:line="245" w:lineRule="auto" w:before="210" w:after="0"/>
+        <w:ind w:left="0" w:right="0" w:firstLine="0"/>
+        <w:jc w:val="center"/>
       </w:pPr>
       <w:r>
         <w:rPr>
-          <w:rFonts w:ascii="Calibri" w:hAnsi="Calibri" w:eastAsia="微软雅黑"/>
+          <w:w w:val="102.16666327582465"/>
+          <w:rFonts w:ascii="Noto Sans" w:hAnsi="Noto Sans" w:eastAsia="Noto Sans"/>
           <w:b w:val="0"/>
-          <w:sz w:val="19"/>
+          <w:i w:val="0"/>
+          <w:color w:val="1A1A1A"/>
+          <w:sz w:val="18"/>
         </w:rPr>
-        <w:t>Strong communicator and fast learner; turns field issues into actionable R&amp;D inputs and customer-ready solutions. Aiming to deepen overseas technical support in semiconductor equipment or robotics, then grow toward overseas sales / hybrid roles.</w:t>
+        <w:t xml:space="preserve">Strong communicator and fast learner; turns field issues into actionable R&amp;D inputs and customer-ready solutions. Aiming to </w:t>
+      </w:r>
+      <w:r>
+        <w:rPr>
+          <w:w w:val="102.16666327582465"/>
+          <w:rFonts w:ascii="Noto Sans" w:hAnsi="Noto Sans" w:eastAsia="Noto Sans"/>
+          <w:b w:val="0"/>
+          <w:i w:val="0"/>
+          <w:color w:val="1A1A1A"/>
+          <w:sz w:val="18"/>
+        </w:rPr>
+        <w:t>deepen overseas technical support in semiconductor equipment or robotics, then grow toward overseas sales / hybrid roles.</w:t>
       </w:r>
     </w:p>
     <w:sectPr>
-      <w:pgSz w:w="11906" w:h="16838"/>
-      <w:pgMar w:top="680" w:right="794" w:bottom="680" w:left="794" w:header="720" w:footer="720" w:gutter="0"/>
-      <w:cols w:space="720"/>
+      <w:pgSz w:w="11899" w:h="16838"/>
+      <w:pgMar w:top="250" w:right="524" w:bottom="1440" w:left="570" w:header="720" w:footer="720" w:gutter="0"/>
+      <w:cols/>
       <w:docGrid w:linePitch="360"/>
     </w:sectPr>
   </w:body>

</xml_diff>